<commit_message>
Exhibit A states who contributed what to the Company and how the Company allocated that capital among the series, with what it retained; the questionnaire asks it that way and refuses over-allocation; signature and date rules are drawn to one right edge
Co-Authored-By: Claude Fable 5.1 <noreply@anthropic.com>
</commit_message>
<xml_diff>
--- a/docs/word/FPSLLC Operating Agreement - Manager-Managed (S Corporation) - DRAFT.docx
+++ b/docs/word/FPSLLC Operating Agreement - Manager-Managed (S Corporation) - DRAFT.docx
@@ -4798,26 +4798,156 @@
     </w:p>
     <w:p>
       <w:pPr>
-        <w:widowControl/>
-        <w:spacing w:after="160"/>
-        <w:jc w:val="both"/>
-      </w:pPr>
-      <w:r>
-        <w:rPr>
-          <w:rFonts w:ascii="Times New Roman" w:hAnsi="Times New Roman"/>
-          <w:b/>
-          <w:sz w:val="24"/>
-          <w:szCs w:val="24"/>
-        </w:rPr>
-        <w:t xml:space="preserve">Initial contributions to Protected Series, treated as contributed first to the Company by the Members in proportion to their Percentage Interests and then by the Company to the series:</w:t>
-      </w:r>
-      <w:r>
-        <w:rPr>
-          <w:rFonts w:ascii="Times New Roman" w:hAnsi="Times New Roman"/>
-          <w:sz w:val="24"/>
-          <w:szCs w:val="24"/>
-        </w:rPr>
-        <w:t xml:space="preserve"> [SERIES CONTRIBUTIONS]</w:t>
+        <w:keepNext/>
+        <w:widowControl/>
+        <w:spacing w:after="160"/>
+        <w:jc w:val="both"/>
+      </w:pPr>
+      <w:r>
+        <w:rPr>
+          <w:rFonts w:ascii="Times New Roman" w:hAnsi="Times New Roman"/>
+          <w:b/>
+          <w:sz w:val="24"/>
+          <w:szCs w:val="24"/>
+        </w:rPr>
+        <w:t xml:space="preserve">Allocation of the Company's capital to the Protected Series:</w:t>
+      </w:r>
+    </w:p>
+    <w:tbl>
+      <w:tblPr>
+        <w:tblStyle w:val="TableGrid"/>
+        <w:tblW w:w="0" w:type="auto"/>
+        <w:tblBorders>
+          <w:top w:val="single" w:sz="4" w:space="0" w:color="999999"/>
+          <w:left w:val="single" w:sz="4" w:space="0" w:color="999999"/>
+          <w:bottom w:val="single" w:sz="4" w:space="0" w:color="999999"/>
+          <w:right w:val="single" w:sz="4" w:space="0" w:color="999999"/>
+          <w:insideH w:val="single" w:sz="4" w:space="0" w:color="999999"/>
+          <w:insideV w:val="single" w:sz="4" w:space="0" w:color="999999"/>
+        </w:tblBorders>
+      </w:tblPr>
+      <w:tblGrid>
+        <w:gridCol w:w="4680"/>
+        <w:gridCol w:w="4680"/>
+      </w:tblGrid>
+      <w:tr>
+        <w:trPr>
+          <w:tblHeader/>
+          <w:cantSplit/>
+        </w:trPr>
+        <w:tc>
+          <w:tcPr>
+            <w:tcW w:w="4680" w:type="dxa"/>
+            <w:tcMar>
+              <w:top w:w="60" w:type="dxa"/>
+              <w:left w:w="108" w:type="dxa"/>
+              <w:bottom w:w="60" w:type="dxa"/>
+              <w:right w:w="108" w:type="dxa"/>
+            </w:tcMar>
+          </w:tcPr>
+          <w:p>
+            <w:pPr>
+              <w:keepLines/>
+              <w:widowControl/>
+              <w:spacing w:before="40" w:after="40"/>
+            </w:pPr>
+            <w:r>
+              <w:rPr>
+                <w:rFonts w:ascii="Times New Roman" w:hAnsi="Times New Roman"/>
+                <w:b/>
+                <w:sz w:val="22"/>
+                <w:szCs w:val="22"/>
+              </w:rPr>
+              <w:t xml:space="preserve">Protected Series</w:t>
+            </w:r>
+          </w:p>
+        </w:tc>
+        <w:tc>
+          <w:tcPr>
+            <w:tcW w:w="4680" w:type="dxa"/>
+            <w:tcMar>
+              <w:top w:w="60" w:type="dxa"/>
+              <w:left w:w="108" w:type="dxa"/>
+              <w:bottom w:w="60" w:type="dxa"/>
+              <w:right w:w="108" w:type="dxa"/>
+            </w:tcMar>
+          </w:tcPr>
+          <w:p>
+            <w:pPr>
+              <w:keepLines/>
+              <w:widowControl/>
+              <w:spacing w:before="40" w:after="40"/>
+            </w:pPr>
+            <w:r>
+              <w:rPr>
+                <w:rFonts w:ascii="Times New Roman" w:hAnsi="Times New Roman"/>
+                <w:b/>
+                <w:sz w:val="22"/>
+                <w:szCs w:val="22"/>
+              </w:rPr>
+              <w:t xml:space="preserve">Capital allocated by the Company</w:t>
+            </w:r>
+          </w:p>
+        </w:tc>
+      </w:tr>
+    </w:tbl>
+    <w:p>
+      <w:pPr>
+        <w:widowControl/>
+        <w:spacing w:after="160"/>
+      </w:pPr>
+      <w:r>
+        <w:rPr>
+          <w:rFonts w:ascii="Times New Roman" w:hAnsi="Times New Roman"/>
+          <w:sz w:val="24"/>
+        </w:rPr>
+      </w:r>
+    </w:p>
+    <w:p>
+      <w:pPr>
+        <w:widowControl/>
+        <w:spacing w:after="160"/>
+        <w:jc w:val="both"/>
+      </w:pPr>
+      <w:r>
+        <w:rPr>
+          <w:rFonts w:ascii="Times New Roman" w:hAnsi="Times New Roman"/>
+          <w:sz w:val="24"/>
+          <w:szCs w:val="24"/>
+        </w:rPr>
+        <w:t xml:space="preserve">| [SERIES] | [CONTRIBUTION] |</w:t>
+      </w:r>
+    </w:p>
+    <w:p>
+      <w:pPr>
+        <w:widowControl/>
+        <w:spacing w:after="160"/>
+        <w:jc w:val="both"/>
+      </w:pPr>
+      <w:r>
+        <w:rPr>
+          <w:rFonts w:ascii="Times New Roman" w:hAnsi="Times New Roman"/>
+          <w:sz w:val="24"/>
+          <w:szCs w:val="24"/>
+        </w:rPr>
+        <w:t xml:space="preserve">| </w:t>
+      </w:r>
+      <w:r>
+        <w:rPr>
+          <w:rFonts w:ascii="Times New Roman" w:hAnsi="Times New Roman"/>
+          <w:b/>
+          <w:sz w:val="24"/>
+          <w:szCs w:val="24"/>
+        </w:rPr>
+        <w:t xml:space="preserve">Retained by the Company</w:t>
+      </w:r>
+      <w:r>
+        <w:rPr>
+          <w:rFonts w:ascii="Times New Roman" w:hAnsi="Times New Roman"/>
+          <w:sz w:val="24"/>
+          <w:szCs w:val="24"/>
+        </w:rPr>
+        <w:t xml:space="preserve"> | [RETAINED] |</w:t>
       </w:r>
     </w:p>
     <w:p>

</xml_diff>

<commit_message>
Capital as a list of assets: each with an agreed value, who contributed it (equally or by share), and where the Company allocated it, cash split by amount; Exhibit A computes what each owner contributed, lists the assets, and totals each series and what the Company retained; the Series Exhibits show what each received; the questionnaire opens with Adam's example
Co-Authored-By: Claude Fable 5.1 <noreply@anthropic.com>
</commit_message>
<xml_diff>
--- a/docs/word/FPSLLC Operating Agreement - Manager-Managed (S Corporation) - DRAFT.docx
+++ b/docs/word/FPSLLC Operating Agreement - Manager-Managed (S Corporation) - DRAFT.docx
@@ -4810,7 +4810,7 @@
           <w:sz w:val="24"/>
           <w:szCs w:val="24"/>
         </w:rPr>
-        <w:t xml:space="preserve">Allocation of the Company's capital to the Protected Series:</w:t>
+        <w:t xml:space="preserve">Contributed assets:</w:t>
       </w:r>
     </w:p>
     <w:tbl>
@@ -4827,8 +4827,10 @@
         </w:tblBorders>
       </w:tblPr>
       <w:tblGrid>
-        <w:gridCol w:w="4680"/>
-        <w:gridCol w:w="4680"/>
+        <w:gridCol w:w="2340"/>
+        <w:gridCol w:w="2340"/>
+        <w:gridCol w:w="2340"/>
+        <w:gridCol w:w="2340"/>
       </w:tblGrid>
       <w:tr>
         <w:trPr>
@@ -4837,7 +4839,184 @@
         </w:trPr>
         <w:tc>
           <w:tcPr>
-            <w:tcW w:w="4680" w:type="dxa"/>
+            <w:tcW w:w="2340" w:type="dxa"/>
+            <w:tcMar>
+              <w:top w:w="60" w:type="dxa"/>
+              <w:left w:w="108" w:type="dxa"/>
+              <w:bottom w:w="60" w:type="dxa"/>
+              <w:right w:w="108" w:type="dxa"/>
+            </w:tcMar>
+          </w:tcPr>
+          <w:p>
+            <w:pPr>
+              <w:keepLines/>
+              <w:widowControl/>
+              <w:spacing w:before="40" w:after="40"/>
+            </w:pPr>
+            <w:r>
+              <w:rPr>
+                <w:rFonts w:ascii="Times New Roman" w:hAnsi="Times New Roman"/>
+                <w:b/>
+                <w:sz w:val="22"/>
+                <w:szCs w:val="22"/>
+              </w:rPr>
+              <w:t xml:space="preserve">Asset</w:t>
+            </w:r>
+          </w:p>
+        </w:tc>
+        <w:tc>
+          <w:tcPr>
+            <w:tcW w:w="2340" w:type="dxa"/>
+            <w:tcMar>
+              <w:top w:w="60" w:type="dxa"/>
+              <w:left w:w="108" w:type="dxa"/>
+              <w:bottom w:w="60" w:type="dxa"/>
+              <w:right w:w="108" w:type="dxa"/>
+            </w:tcMar>
+          </w:tcPr>
+          <w:p>
+            <w:pPr>
+              <w:keepLines/>
+              <w:widowControl/>
+              <w:spacing w:before="40" w:after="40"/>
+            </w:pPr>
+            <w:r>
+              <w:rPr>
+                <w:rFonts w:ascii="Times New Roman" w:hAnsi="Times New Roman"/>
+                <w:b/>
+                <w:sz w:val="22"/>
+                <w:szCs w:val="22"/>
+              </w:rPr>
+              <w:t xml:space="preserve">Agreed value</w:t>
+            </w:r>
+          </w:p>
+        </w:tc>
+        <w:tc>
+          <w:tcPr>
+            <w:tcW w:w="2340" w:type="dxa"/>
+            <w:tcMar>
+              <w:top w:w="60" w:type="dxa"/>
+              <w:left w:w="108" w:type="dxa"/>
+              <w:bottom w:w="60" w:type="dxa"/>
+              <w:right w:w="108" w:type="dxa"/>
+            </w:tcMar>
+          </w:tcPr>
+          <w:p>
+            <w:pPr>
+              <w:keepLines/>
+              <w:widowControl/>
+              <w:spacing w:before="40" w:after="40"/>
+            </w:pPr>
+            <w:r>
+              <w:rPr>
+                <w:rFonts w:ascii="Times New Roman" w:hAnsi="Times New Roman"/>
+                <w:b/>
+                <w:sz w:val="22"/>
+                <w:szCs w:val="22"/>
+              </w:rPr>
+              <w:t xml:space="preserve">Contributed by</w:t>
+            </w:r>
+          </w:p>
+        </w:tc>
+        <w:tc>
+          <w:tcPr>
+            <w:tcW w:w="2340" w:type="dxa"/>
+            <w:tcMar>
+              <w:top w:w="60" w:type="dxa"/>
+              <w:left w:w="108" w:type="dxa"/>
+              <w:bottom w:w="60" w:type="dxa"/>
+              <w:right w:w="108" w:type="dxa"/>
+            </w:tcMar>
+          </w:tcPr>
+          <w:p>
+            <w:pPr>
+              <w:keepLines/>
+              <w:widowControl/>
+              <w:spacing w:before="40" w:after="40"/>
+            </w:pPr>
+            <w:r>
+              <w:rPr>
+                <w:rFonts w:ascii="Times New Roman" w:hAnsi="Times New Roman"/>
+                <w:b/>
+                <w:sz w:val="22"/>
+                <w:szCs w:val="22"/>
+              </w:rPr>
+              <w:t xml:space="preserve">Allocated to</w:t>
+            </w:r>
+          </w:p>
+        </w:tc>
+      </w:tr>
+    </w:tbl>
+    <w:p>
+      <w:pPr>
+        <w:widowControl/>
+        <w:spacing w:after="160"/>
+      </w:pPr>
+      <w:r>
+        <w:rPr>
+          <w:rFonts w:ascii="Times New Roman" w:hAnsi="Times New Roman"/>
+          <w:sz w:val="24"/>
+        </w:rPr>
+      </w:r>
+    </w:p>
+    <w:p>
+      <w:pPr>
+        <w:widowControl/>
+        <w:spacing w:after="160"/>
+        <w:jc w:val="both"/>
+      </w:pPr>
+      <w:r>
+        <w:rPr>
+          <w:rFonts w:ascii="Times New Roman" w:hAnsi="Times New Roman"/>
+          <w:sz w:val="24"/>
+          <w:szCs w:val="24"/>
+        </w:rPr>
+        <w:t xml:space="preserve">| [ASSET] | [ASSET VALUE] | [ASSET BY] | [ASSET TO] |</w:t>
+      </w:r>
+    </w:p>
+    <w:p>
+      <w:pPr>
+        <w:keepNext/>
+        <w:widowControl/>
+        <w:spacing w:after="160"/>
+        <w:jc w:val="both"/>
+      </w:pPr>
+      <w:r>
+        <w:rPr>
+          <w:rFonts w:ascii="Times New Roman" w:hAnsi="Times New Roman"/>
+          <w:b/>
+          <w:sz w:val="24"/>
+          <w:szCs w:val="24"/>
+        </w:rPr>
+        <w:t xml:space="preserve">Allocation of the Company's capital to the Protected Series:</w:t>
+      </w:r>
+    </w:p>
+    <w:tbl>
+      <w:tblPr>
+        <w:tblStyle w:val="TableGrid"/>
+        <w:tblW w:w="0" w:type="auto"/>
+        <w:tblBorders>
+          <w:top w:val="single" w:sz="4" w:space="0" w:color="999999"/>
+          <w:left w:val="single" w:sz="4" w:space="0" w:color="999999"/>
+          <w:bottom w:val="single" w:sz="4" w:space="0" w:color="999999"/>
+          <w:right w:val="single" w:sz="4" w:space="0" w:color="999999"/>
+          <w:insideH w:val="single" w:sz="4" w:space="0" w:color="999999"/>
+          <w:insideV w:val="single" w:sz="4" w:space="0" w:color="999999"/>
+        </w:tblBorders>
+      </w:tblPr>
+      <w:tblGrid>
+        <w:gridCol w:w="3120"/>
+        <w:gridCol w:w="3120"/>
+        <w:gridCol w:w="3120"/>
+      </w:tblGrid>
+      <w:tr>
+        <w:trPr>
+          <w:tblHeader/>
+          <w:cantSplit/>
+        </w:trPr>
+        <w:tc>
+          <w:tcPr>
+            <w:tcW w:w="3120" w:type="dxa"/>
             <w:tcMar>
               <w:top w:w="60" w:type="dxa"/>
               <w:left w:w="108" w:type="dxa"/>
@@ -4864,7 +5043,7 @@
         </w:tc>
         <w:tc>
           <w:tcPr>
-            <w:tcW w:w="4680" w:type="dxa"/>
+            <w:tcW w:w="3120" w:type="dxa"/>
             <w:tcMar>
               <w:top w:w="60" w:type="dxa"/>
               <w:left w:w="108" w:type="dxa"/>
@@ -4885,7 +5064,34 @@
                 <w:sz w:val="22"/>
                 <w:szCs w:val="22"/>
               </w:rPr>
-              <w:t xml:space="preserve">Capital allocated by the Company</w:t>
+              <w:t xml:space="preserve">Assets allocated by the Company</w:t>
+            </w:r>
+          </w:p>
+        </w:tc>
+        <w:tc>
+          <w:tcPr>
+            <w:tcW w:w="3120" w:type="dxa"/>
+            <w:tcMar>
+              <w:top w:w="60" w:type="dxa"/>
+              <w:left w:w="108" w:type="dxa"/>
+              <w:bottom w:w="60" w:type="dxa"/>
+              <w:right w:w="108" w:type="dxa"/>
+            </w:tcMar>
+          </w:tcPr>
+          <w:p>
+            <w:pPr>
+              <w:keepLines/>
+              <w:widowControl/>
+              <w:spacing w:before="40" w:after="40"/>
+            </w:pPr>
+            <w:r>
+              <w:rPr>
+                <w:rFonts w:ascii="Times New Roman" w:hAnsi="Times New Roman"/>
+                <w:b/>
+                <w:sz w:val="22"/>
+                <w:szCs w:val="22"/>
+              </w:rPr>
+              <w:t xml:space="preserve">Total</w:t>
             </w:r>
           </w:p>
         </w:tc>
@@ -4915,7 +5121,7 @@
           <w:sz w:val="24"/>
           <w:szCs w:val="24"/>
         </w:rPr>
-        <w:t xml:space="preserve">| [SERIES] | [CONTRIBUTION] |</w:t>
+        <w:t xml:space="preserve">| [SERIES] | [CONTRIBUTION] | [SERIES TOTAL] |</w:t>
       </w:r>
     </w:p>
     <w:p>
@@ -4947,7 +5153,7 @@
           <w:sz w:val="24"/>
           <w:szCs w:val="24"/>
         </w:rPr>
-        <w:t xml:space="preserve"> | [RETAINED] |</w:t>
+        <w:t xml:space="preserve"> | [RETAINED ASSETS] | [RETAINED] |</w:t>
       </w:r>
     </w:p>
     <w:p>

</xml_diff>

<commit_message>
Series Exhibit: the Dissolution events row is gone; Special terms come from a new questionnaire card, spelled out or 'See attached' under a supplied title
Co-Authored-By: Claude Fable 5.1 <noreply@anthropic.com>
</commit_message>
<xml_diff>
--- a/docs/word/FPSLLC Operating Agreement - Manager-Managed (S Corporation) - DRAFT.docx
+++ b/docs/word/FPSLLC Operating Agreement - Manager-Managed (S Corporation) - DRAFT.docx
@@ -5759,63 +5759,6 @@
                 <w:szCs w:val="22"/>
               </w:rPr>
               <w:t xml:space="preserve">[None / variations from the base Agreement — may not vary Article 8 or non-variable provisions of the Act]</w:t>
-            </w:r>
-          </w:p>
-        </w:tc>
-      </w:tr>
-      <w:tr>
-        <w:trPr>
-          <w:cantSplit/>
-        </w:trPr>
-        <w:tc>
-          <w:tcPr>
-            <w:tcW w:w="4680" w:type="dxa"/>
-            <w:tcMar>
-              <w:top w:w="60" w:type="dxa"/>
-              <w:left w:w="108" w:type="dxa"/>
-              <w:bottom w:w="60" w:type="dxa"/>
-              <w:right w:w="108" w:type="dxa"/>
-            </w:tcMar>
-          </w:tcPr>
-          <w:p>
-            <w:pPr>
-              <w:keepLines/>
-              <w:widowControl/>
-              <w:spacing w:before="40" w:after="40"/>
-            </w:pPr>
-            <w:r>
-              <w:rPr>
-                <w:rFonts w:ascii="Times New Roman" w:hAnsi="Times New Roman"/>
-                <w:sz w:val="22"/>
-                <w:szCs w:val="22"/>
-              </w:rPr>
-              <w:t xml:space="preserve">Dissolution events specific to this Protected Series (if any)</w:t>
-            </w:r>
-          </w:p>
-        </w:tc>
-        <w:tc>
-          <w:tcPr>
-            <w:tcW w:w="4680" w:type="dxa"/>
-            <w:tcMar>
-              <w:top w:w="60" w:type="dxa"/>
-              <w:left w:w="108" w:type="dxa"/>
-              <w:bottom w:w="60" w:type="dxa"/>
-              <w:right w:w="108" w:type="dxa"/>
-            </w:tcMar>
-          </w:tcPr>
-          <w:p>
-            <w:pPr>
-              <w:keepLines/>
-              <w:widowControl/>
-              <w:spacing w:before="40" w:after="40"/>
-            </w:pPr>
-            <w:r>
-              <w:rPr>
-                <w:rFonts w:ascii="Times New Roman" w:hAnsi="Times New Roman"/>
-                <w:sz w:val="22"/>
-                <w:szCs w:val="22"/>
-              </w:rPr>
-              <w:t xml:space="preserve">[None / describe]</w:t>
             </w:r>
           </w:p>
         </w:tc>

</xml_diff>

<commit_message>
Transfer on death: a backup beneficiary who takes if the first does not survive the Member, asked in the questionnaire and printed beside the first on Exhibit A
Co-Authored-By: Claude Fable 5.1 <noreply@anthropic.com>
</commit_message>
<xml_diff>
--- a/docs/word/FPSLLC Operating Agreement - Manager-Managed (S Corporation) - DRAFT.docx
+++ b/docs/word/FPSLLC Operating Agreement - Manager-Managed (S Corporation) - DRAFT.docx
@@ -1725,7 +1725,7 @@
           <w:sz w:val="24"/>
           <w:szCs w:val="24"/>
         </w:rPr>
-        <w:t xml:space="preserve"> Each Member's Membership Interest is "registered" with the Company within the meaning of s. 711.501(7), Florida Statutes. Exhibit A serves as the initial "registration in beneficiary form" under ss. 711.50–711.512, Florida Statutes, and reflects each Member's designation, if any, of the person or persons who will become the owner of that Member's Membership Interest upon that Member's death. A Member who is an individual may designate any person or entity as a beneficiary. Members who hold a Membership Interest jointly as tenants in common may not designate a TOD beneficiary. A Member may change, delete, or add a TOD designation by a signed writing, witnessed by two witnesses, delivered to the Manager; the change is effective upon receipt unless the Manager objects in writing within seven (7) days, and the Manager shall thereafter update Exhibit A (though updating is not required for effectiveness). Upon the designating Member's death, the designated beneficiary automatically succeeds to the deceased Member's transferable interest — including the economic rights of the deceased Member's Percentage Interest — taking subject to this Agreement, and holds the rights of a transferee described in Section 10.3 until admitted as a Member. A beneficiary is admitted as a Member upon delivery to the Company of a written agreement to be bound by this Agreement and the written consent of a Majority in Interest of the Members other than the deceased Member.</w:t>
+        <w:t xml:space="preserve"> Each Member's Membership Interest is "registered" with the Company within the meaning of s. 711.501(7), Florida Statutes. Exhibit A serves as the initial "registration in beneficiary form" under ss. 711.50–711.512, Florida Statutes, and reflects each Member's designation, if any, of the person or persons who will become the owner of that Member's Membership Interest upon that Member's death. A Member who is an individual may designate any person or entity as a beneficiary. A designation may name a backup beneficiary to take if the first beneficiary does not survive the Member. Members who hold a Membership Interest jointly as tenants in common may not designate a TOD beneficiary. A Member may change, delete, or add a TOD designation by a signed writing, witnessed by two witnesses, delivered to the Manager; the change is effective upon receipt unless the Manager objects in writing within seven (7) days, and the Manager shall thereafter update Exhibit A (though updating is not required for effectiveness). Upon the designating Member's death, the designated beneficiary automatically succeeds to the deceased Member's transferable interest — including the economic rights of the deceased Member's Percentage Interest — taking subject to this Agreement, and holds the rights of a transferee described in Section 10.3 until admitted as a Member. A beneficiary is admitted as a Member upon delivery to the Company of a written agreement to be bound by this Agreement and the written consent of a Majority in Interest of the Members other than the deceased Member.</w:t>
       </w:r>
     </w:p>
     <w:p>
@@ -5187,8 +5187,9 @@
         </w:tblBorders>
       </w:tblPr>
       <w:tblGrid>
-        <w:gridCol w:w="4680"/>
-        <w:gridCol w:w="4680"/>
+        <w:gridCol w:w="3120"/>
+        <w:gridCol w:w="3120"/>
+        <w:gridCol w:w="3120"/>
       </w:tblGrid>
       <w:tr>
         <w:trPr>
@@ -5197,7 +5198,7 @@
         </w:trPr>
         <w:tc>
           <w:tcPr>
-            <w:tcW w:w="4680" w:type="dxa"/>
+            <w:tcW w:w="3120" w:type="dxa"/>
             <w:tcMar>
               <w:top w:w="60" w:type="dxa"/>
               <w:left w:w="108" w:type="dxa"/>
@@ -5224,7 +5225,7 @@
         </w:tc>
         <w:tc>
           <w:tcPr>
-            <w:tcW w:w="4680" w:type="dxa"/>
+            <w:tcW w:w="3120" w:type="dxa"/>
             <w:tcMar>
               <w:top w:w="60" w:type="dxa"/>
               <w:left w:w="108" w:type="dxa"/>
@@ -5249,6 +5250,33 @@
             </w:r>
           </w:p>
         </w:tc>
+        <w:tc>
+          <w:tcPr>
+            <w:tcW w:w="3120" w:type="dxa"/>
+            <w:tcMar>
+              <w:top w:w="60" w:type="dxa"/>
+              <w:left w:w="108" w:type="dxa"/>
+              <w:bottom w:w="60" w:type="dxa"/>
+              <w:right w:w="108" w:type="dxa"/>
+            </w:tcMar>
+          </w:tcPr>
+          <w:p>
+            <w:pPr>
+              <w:keepLines/>
+              <w:widowControl/>
+              <w:spacing w:before="40" w:after="40"/>
+            </w:pPr>
+            <w:r>
+              <w:rPr>
+                <w:rFonts w:ascii="Times New Roman" w:hAnsi="Times New Roman"/>
+                <w:b/>
+                <w:sz w:val="22"/>
+                <w:szCs w:val="22"/>
+              </w:rPr>
+              <w:t xml:space="preserve">If that beneficiary does not survive the Member</w:t>
+            </w:r>
+          </w:p>
+        </w:tc>
       </w:tr>
     </w:tbl>
     <w:p>
@@ -5275,7 +5303,7 @@
           <w:sz w:val="24"/>
           <w:szCs w:val="24"/>
         </w:rPr>
-        <w:t xml:space="preserve">| [MEMBER NAME] | [MEMBER TOD] |</w:t>
+        <w:t xml:space="preserve">| [MEMBER NAME] | [MEMBER TOD] | [MEMBER TOD BACKUP] |</w:t>
       </w:r>
     </w:p>
     <w:p>

</xml_diff>